<commit_message>
docs: embed screenshots in SUBMISSION.md and regenerate SUBMISSION.docx
</commit_message>
<xml_diff>
--- a/Final Project- VidyaLink/SUBMISSION.docx
+++ b/Final Project- VidyaLink/SUBMISSION.docx
@@ -628,12 +628,7 @@
         <w:pStyle w:val="MdParagraph"/>
       </w:pPr>
       <w:r>
-        <w:rPr>
-          <w:rStyle w:val="MdEm"/>
-          <w:i/>
-          <w:iCs/>
-        </w:rPr>
-        <w:t xml:space="preserve">Below are placeholder slots indicating where screenshots of the working web application should be placed during PDF export:</w:t>
+        <w:t xml:space="preserve">Below are screenshots demonstrating the working web application:</w:t>
       </w:r>
     </w:p>
     <w:p>
@@ -656,22 +651,14 @@
           <w:b/>
           <w:bCs/>
         </w:rPr>
-        <w:t xml:space="preserve">[Screenshot 1: Resource Vault Main Page]</w:t>
-      </w:r>
-      <w:r>
-        <w:rPr>
-          <w:rStyle w:val="MdBr"/>
-        </w:rPr>
-        <w:br/>
-        <w:t xml:space="preserve"/>
-      </w:r>
-      <w:r>
-        <w:rPr>
-          <w:rStyle w:val="MdEm"/>
-          <w:i/>
-          <w:iCs/>
-        </w:rPr>
-        <w:t xml:space="preserve">Placeholder for the main landing page showing the list of 15 seeded resources with their tags and verified badges.</w:t>
+        <w:t xml:space="preserve">Resource Vault Main Page</w:t>
+      </w:r>
+      <w:r>
+        <w:t xml:space="preserve">:
+</w:t>
+      </w:r>
+      <w:r>
+        <w:t xml:space="preserve">[!Resource Vault Main Page](screenshots/loaded_index_page.png)</w:t>
       </w:r>
     </w:p>
     <w:p>
@@ -689,22 +676,14 @@
           <w:b/>
           <w:bCs/>
         </w:rPr>
-        <w:t xml:space="preserve">[Screenshot 2: Search and Filtering]</w:t>
-      </w:r>
-      <w:r>
-        <w:rPr>
-          <w:rStyle w:val="MdBr"/>
-        </w:rPr>
-        <w:br/>
-        <w:t xml:space="preserve"/>
-      </w:r>
-      <w:r>
-        <w:rPr>
-          <w:rStyle w:val="MdEm"/>
-          <w:i/>
-          <w:iCs/>
-        </w:rPr>
-        <w:t xml:space="preserve">Placeholder showing the resource list filtered by a specific subject (e.g., "Computer Science") and matching a live search term.</w:t>
+        <w:t xml:space="preserve">Search and Subject Filtering</w:t>
+      </w:r>
+      <w:r>
+        <w:t xml:space="preserve">:
+</w:t>
+      </w:r>
+      <w:r>
+        <w:t xml:space="preserve">[!Search and Subject Filtering](screenshots/filter_mathematics_result.png)</w:t>
       </w:r>
     </w:p>
     <w:p>
@@ -722,22 +701,14 @@
           <w:b/>
           <w:bCs/>
         </w:rPr>
-        <w:t xml:space="preserve">[Screenshot 3: Upvote Sorting]</w:t>
-      </w:r>
-      <w:r>
-        <w:rPr>
-          <w:rStyle w:val="MdBr"/>
-        </w:rPr>
-        <w:br/>
-        <w:t xml:space="preserve"/>
-      </w:r>
-      <w:r>
-        <w:rPr>
-          <w:rStyle w:val="MdEm"/>
-          <w:i/>
-          <w:iCs/>
-        </w:rPr>
-        <w:t xml:space="preserve">Placeholder showing the Resource Vault sorted by "Top Upvoted" where upvoted items re-order dynamically.</w:t>
+        <w:t xml:space="preserve">Upvote System and Sorting</w:t>
+      </w:r>
+      <w:r>
+        <w:t xml:space="preserve">:
+</w:t>
+      </w:r>
+      <w:r>
+        <w:t xml:space="preserve">[!Upvote Sorting](screenshots/sorted_top_upvoted.png)</w:t>
       </w:r>
     </w:p>
     <w:p>
@@ -755,22 +726,14 @@
           <w:b/>
           <w:bCs/>
         </w:rPr>
-        <w:t xml:space="preserve">[Screenshot 4: Doubt Board Q&amp;A and Accepted Answer]</w:t>
-      </w:r>
-      <w:r>
-        <w:rPr>
-          <w:rStyle w:val="MdBr"/>
-        </w:rPr>
-        <w:br/>
-        <w:t xml:space="preserve"/>
-      </w:r>
-      <w:r>
-        <w:rPr>
-          <w:rStyle w:val="MdEm"/>
-          <w:i/>
-          <w:iCs/>
-        </w:rPr>
-        <w:t xml:space="preserve">Placeholder showing a doubt details view with multiple answers, where one answer has been marked "Accepted," showing the highlighted blue background and top placement.</w:t>
+        <w:t xml:space="preserve">Doubt Board Details View with Highlighted Accepted Answer</w:t>
+      </w:r>
+      <w:r>
+        <w:t xml:space="preserve">:
+</w:t>
+      </w:r>
+      <w:r>
+        <w:t xml:space="preserve">[!Doubt Board Q&amp;A](screenshots/answers_after_toggle.png)</w:t>
       </w:r>
     </w:p>
     <w:p>
@@ -808,7 +771,7 @@
         <w:t xml:space="preserve">The complete source code for this project, including historical incremental commits and configurations, is available in the public repository:
 </w:t>
       </w:r>
-      <w:hyperlink w:history="1" r:id="rIdoxfjfmrv_vkgw0nhvxodn">
+      <w:hyperlink w:history="1" r:id="rIdtizzqxqvy5lqkpszfcfkd">
         <w:r>
           <w:rPr>
             <w:rStyle w:val="MdLink"/>

</xml_diff>

<commit_message>
docs: update main README with Final Project - VidyaLink details
</commit_message>
<xml_diff>
--- a/Final Project- VidyaLink/SUBMISSION.docx
+++ b/Final Project- VidyaLink/SUBMISSION.docx
@@ -783,7 +783,7 @@
           <w:szCs w:val="24"/>
         </w:rPr>
         <w:drawing>
-          <wp:inline distT="0" distB="0" distL="0" distR="0" wp14:anchorId="4F94EC2C" wp14:editId="6856D3E4">
+          <wp:inline distT="0" distB="0" distL="0" distR="0" wp14:anchorId="4F94EC2C" wp14:editId="608D9643">
             <wp:extent cx="6188710" cy="2939415"/>
             <wp:effectExtent l="0" t="0" r="2540" b="0"/>
             <wp:docPr id="1700406913" name="Picture 1"/>
@@ -862,7 +862,7 @@
           <w:szCs w:val="24"/>
         </w:rPr>
         <w:drawing>
-          <wp:inline distT="0" distB="0" distL="0" distR="0" wp14:anchorId="7F060419" wp14:editId="20E76693">
+          <wp:inline distT="0" distB="0" distL="0" distR="0" wp14:anchorId="7F060419" wp14:editId="3BA914BE">
             <wp:extent cx="6188710" cy="2939415"/>
             <wp:effectExtent l="0" t="0" r="2540" b="0"/>
             <wp:docPr id="1115647387" name="Picture 2"/>
@@ -942,7 +942,7 @@
         </w:rPr>
         <w:lastRenderedPageBreak/>
         <w:drawing>
-          <wp:inline distT="0" distB="0" distL="0" distR="0" wp14:anchorId="28FA1C02" wp14:editId="40F20CF2">
+          <wp:inline distT="0" distB="0" distL="0" distR="0" wp14:anchorId="28FA1C02" wp14:editId="7AC6E76C">
             <wp:extent cx="6188710" cy="2939415"/>
             <wp:effectExtent l="0" t="0" r="2540" b="0"/>
             <wp:docPr id="1260699260" name="Picture 3"/>
@@ -1011,7 +1011,7 @@
           <w:noProof/>
         </w:rPr>
         <w:drawing>
-          <wp:inline distT="0" distB="0" distL="0" distR="0" wp14:anchorId="2E4196AA" wp14:editId="1C1DDE9E">
+          <wp:inline distT="0" distB="0" distL="0" distR="0" wp14:anchorId="2E4196AA" wp14:editId="56078D5C">
             <wp:extent cx="6188710" cy="2939415"/>
             <wp:effectExtent l="0" t="0" r="2540" b="0"/>
             <wp:docPr id="1791022388" name="Picture 4"/>
@@ -1092,7 +1092,25 @@
             <w:szCs w:val="24"/>
             <w:u w:val="single"/>
           </w:rPr>
-          <w:t>GitHub Repository Link</w:t>
+          <w:t>GitHub Reposito</w:t>
+        </w:r>
+        <w:r>
+          <w:rPr>
+            <w:color w:val="0000FF"/>
+            <w:sz w:val="24"/>
+            <w:szCs w:val="24"/>
+            <w:u w:val="single"/>
+          </w:rPr>
+          <w:t>r</w:t>
+        </w:r>
+        <w:r>
+          <w:rPr>
+            <w:color w:val="0000FF"/>
+            <w:sz w:val="24"/>
+            <w:szCs w:val="24"/>
+            <w:u w:val="single"/>
+          </w:rPr>
+          <w:t>y Link</w:t>
         </w:r>
       </w:hyperlink>
     </w:p>

</xml_diff>